<commit_message>
parameter overview added to report
</commit_message>
<xml_diff>
--- a/data/first_ea/analysis/results_slow_mutation.docx
+++ b/data/first_ea/analysis/results_slow_mutation.docx
@@ -10,6 +10,1518 @@
         <w:t>EA Analysis Report: slow_mutation</w:t>
       </w:r>
     </w:p>
+    <w:p>
+      <w:pPr>
+        <w:pStyle w:val="Heading2"/>
+      </w:pPr>
+      <w:r>
+        <w:t>Experiment Parameters</w:t>
+      </w:r>
+    </w:p>
+    <w:tbl>
+      <w:tblPr>
+        <w:tblStyle w:val="LightGrid-Accent1"/>
+        <w:tblW w:type="auto" w:w="0"/>
+        <w:tblLook w:firstColumn="1" w:firstRow="1" w:lastColumn="0" w:lastRow="0" w:noHBand="0" w:noVBand="1" w:val="04A0"/>
+      </w:tblPr>
+      <w:tblGrid>
+        <w:gridCol w:w="4320"/>
+        <w:gridCol w:w="4320"/>
+      </w:tblGrid>
+      <w:tr>
+        <w:tc>
+          <w:tcPr>
+            <w:tcW w:type="dxa" w:w="4320"/>
+          </w:tcPr>
+          <w:p>
+            <w:r>
+              <w:t>Parameter</w:t>
+            </w:r>
+          </w:p>
+        </w:tc>
+        <w:tc>
+          <w:tcPr>
+            <w:tcW w:type="dxa" w:w="4320"/>
+          </w:tcPr>
+          <w:p>
+            <w:r>
+              <w:t>Value</w:t>
+            </w:r>
+          </w:p>
+        </w:tc>
+      </w:tr>
+      <w:tr>
+        <w:tc>
+          <w:tcPr>
+            <w:tcW w:type="dxa" w:w="4320"/>
+          </w:tcPr>
+          <w:p>
+            <w:r>
+              <w:t>Filename</w:t>
+            </w:r>
+          </w:p>
+        </w:tc>
+        <w:tc>
+          <w:tcPr>
+            <w:tcW w:type="dxa" w:w="4320"/>
+          </w:tcPr>
+          <w:p>
+            <w:r>
+              <w:t>2026-04-22_20-57-56_slow_mutation</w:t>
+            </w:r>
+          </w:p>
+        </w:tc>
+      </w:tr>
+      <w:tr>
+        <w:tc>
+          <w:tcPr>
+            <w:tcW w:type="dxa" w:w="4320"/>
+          </w:tcPr>
+          <w:p>
+            <w:r>
+              <w:t>brain_max_decision_delay</w:t>
+            </w:r>
+          </w:p>
+        </w:tc>
+        <w:tc>
+          <w:tcPr>
+            <w:tcW w:type="dxa" w:w="4320"/>
+          </w:tcPr>
+          <w:p>
+            <w:r>
+              <w:t>2.0</w:t>
+            </w:r>
+          </w:p>
+        </w:tc>
+      </w:tr>
+      <w:tr>
+        <w:tc>
+          <w:tcPr>
+            <w:tcW w:type="dxa" w:w="4320"/>
+          </w:tcPr>
+          <w:p>
+            <w:r>
+              <w:t>brain_n_neurons</w:t>
+            </w:r>
+          </w:p>
+        </w:tc>
+        <w:tc>
+          <w:tcPr>
+            <w:tcW w:type="dxa" w:w="4320"/>
+          </w:tcPr>
+          <w:p>
+            <w:r>
+              <w:t>11</w:t>
+            </w:r>
+          </w:p>
+        </w:tc>
+      </w:tr>
+      <w:tr>
+        <w:tc>
+          <w:tcPr>
+            <w:tcW w:type="dxa" w:w="4320"/>
+          </w:tcPr>
+          <w:p>
+            <w:r>
+              <w:t>brain_noise_level</w:t>
+            </w:r>
+          </w:p>
+        </w:tc>
+        <w:tc>
+          <w:tcPr>
+            <w:tcW w:type="dxa" w:w="4320"/>
+          </w:tcPr>
+          <w:p>
+            <w:r>
+              <w:t>0.05</w:t>
+            </w:r>
+          </w:p>
+        </w:tc>
+      </w:tr>
+      <w:tr>
+        <w:tc>
+          <w:tcPr>
+            <w:tcW w:type="dxa" w:w="4320"/>
+          </w:tcPr>
+          <w:p>
+            <w:r>
+              <w:t>experiment_evolutionary_algorithm_elite_selection_metric</w:t>
+            </w:r>
+          </w:p>
+        </w:tc>
+        <w:tc>
+          <w:tcPr>
+            <w:tcW w:type="dxa" w:w="4320"/>
+          </w:tcPr>
+          <w:p>
+            <w:r>
+              <w:t>average</w:t>
+            </w:r>
+          </w:p>
+        </w:tc>
+      </w:tr>
+      <w:tr>
+        <w:tc>
+          <w:tcPr>
+            <w:tcW w:type="dxa" w:w="4320"/>
+          </w:tcPr>
+          <w:p>
+            <w:r>
+              <w:t>experiment_evolutionary_algorithm_elite_size</w:t>
+            </w:r>
+          </w:p>
+        </w:tc>
+        <w:tc>
+          <w:tcPr>
+            <w:tcW w:type="dxa" w:w="4320"/>
+          </w:tcPr>
+          <w:p>
+            <w:r>
+              <w:t>3</w:t>
+            </w:r>
+          </w:p>
+        </w:tc>
+      </w:tr>
+      <w:tr>
+        <w:tc>
+          <w:tcPr>
+            <w:tcW w:type="dxa" w:w="4320"/>
+          </w:tcPr>
+          <w:p>
+            <w:r>
+              <w:t>experiment_evolutionary_algorithm_mutation_method</w:t>
+            </w:r>
+          </w:p>
+        </w:tc>
+        <w:tc>
+          <w:tcPr>
+            <w:tcW w:type="dxa" w:w="4320"/>
+          </w:tcPr>
+          <w:p>
+            <w:r>
+              <w:t>simple</w:t>
+            </w:r>
+          </w:p>
+        </w:tc>
+      </w:tr>
+      <w:tr>
+        <w:tc>
+          <w:tcPr>
+            <w:tcW w:type="dxa" w:w="4320"/>
+          </w:tcPr>
+          <w:p>
+            <w:r>
+              <w:t>experiment_evolutionary_algorithm_mutation_rate</w:t>
+            </w:r>
+          </w:p>
+        </w:tc>
+        <w:tc>
+          <w:tcPr>
+            <w:tcW w:type="dxa" w:w="4320"/>
+          </w:tcPr>
+          <w:p>
+            <w:r>
+              <w:t>0.05</w:t>
+            </w:r>
+          </w:p>
+        </w:tc>
+      </w:tr>
+      <w:tr>
+        <w:tc>
+          <w:tcPr>
+            <w:tcW w:type="dxa" w:w="4320"/>
+          </w:tcPr>
+          <w:p>
+            <w:r>
+              <w:t>experiment_evolutionary_algorithm_num_generations</w:t>
+            </w:r>
+          </w:p>
+        </w:tc>
+        <w:tc>
+          <w:tcPr>
+            <w:tcW w:type="dxa" w:w="4320"/>
+          </w:tcPr>
+          <w:p>
+            <w:r>
+              <w:t>100</w:t>
+            </w:r>
+          </w:p>
+        </w:tc>
+      </w:tr>
+      <w:tr>
+        <w:tc>
+          <w:tcPr>
+            <w:tcW w:type="dxa" w:w="4320"/>
+          </w:tcPr>
+          <w:p>
+            <w:r>
+              <w:t>experiment_genome_type</w:t>
+            </w:r>
+          </w:p>
+        </w:tc>
+        <w:tc>
+          <w:tcPr>
+            <w:tcW w:type="dxa" w:w="4320"/>
+          </w:tcPr>
+          <w:p>
+            <w:r>
+              <w:t>random</w:t>
+            </w:r>
+          </w:p>
+        </w:tc>
+      </w:tr>
+      <w:tr>
+        <w:tc>
+          <w:tcPr>
+            <w:tcW w:type="dxa" w:w="4320"/>
+          </w:tcPr>
+          <w:p>
+            <w:r>
+              <w:t>experiment_max_ticks</w:t>
+            </w:r>
+          </w:p>
+        </w:tc>
+        <w:tc>
+          <w:tcPr>
+            <w:tcW w:type="dxa" w:w="4320"/>
+          </w:tcPr>
+          <w:p>
+            <w:r>
+              <w:t>2000</w:t>
+            </w:r>
+          </w:p>
+        </w:tc>
+      </w:tr>
+      <w:tr>
+        <w:tc>
+          <w:tcPr>
+            <w:tcW w:type="dxa" w:w="4320"/>
+          </w:tcPr>
+          <w:p>
+            <w:r>
+              <w:t>experiment_n_runs</w:t>
+            </w:r>
+          </w:p>
+        </w:tc>
+        <w:tc>
+          <w:tcPr>
+            <w:tcW w:type="dxa" w:w="4320"/>
+          </w:tcPr>
+          <w:p>
+            <w:r>
+              <w:t>300</w:t>
+            </w:r>
+          </w:p>
+        </w:tc>
+      </w:tr>
+      <w:tr>
+        <w:tc>
+          <w:tcPr>
+            <w:tcW w:type="dxa" w:w="4320"/>
+          </w:tcPr>
+          <w:p>
+            <w:r>
+              <w:t>experiment_population_size</w:t>
+            </w:r>
+          </w:p>
+        </w:tc>
+        <w:tc>
+          <w:tcPr>
+            <w:tcW w:type="dxa" w:w="4320"/>
+          </w:tcPr>
+          <w:p>
+            <w:r>
+              <w:t>100</w:t>
+            </w:r>
+          </w:p>
+        </w:tc>
+      </w:tr>
+      <w:tr>
+        <w:tc>
+          <w:tcPr>
+            <w:tcW w:type="dxa" w:w="4320"/>
+          </w:tcPr>
+          <w:p>
+            <w:r>
+              <w:t>food_feeding_paradigm_initial</w:t>
+            </w:r>
+          </w:p>
+        </w:tc>
+        <w:tc>
+          <w:tcPr>
+            <w:tcW w:type="dxa" w:w="4320"/>
+          </w:tcPr>
+          <w:p>
+            <w:r>
+              <w:t>True</w:t>
+            </w:r>
+          </w:p>
+        </w:tc>
+      </w:tr>
+      <w:tr>
+        <w:tc>
+          <w:tcPr>
+            <w:tcW w:type="dxa" w:w="4320"/>
+          </w:tcPr>
+          <w:p>
+            <w:r>
+              <w:t>food_feeding_paradigm_regrow</w:t>
+            </w:r>
+          </w:p>
+        </w:tc>
+        <w:tc>
+          <w:tcPr>
+            <w:tcW w:type="dxa" w:w="4320"/>
+          </w:tcPr>
+          <w:p>
+            <w:r>
+              <w:t>False</w:t>
+            </w:r>
+          </w:p>
+        </w:tc>
+      </w:tr>
+      <w:tr>
+        <w:tc>
+          <w:tcPr>
+            <w:tcW w:type="dxa" w:w="4320"/>
+          </w:tcPr>
+          <w:p>
+            <w:r>
+              <w:t>food_initial_fraction_per_cell</w:t>
+            </w:r>
+          </w:p>
+        </w:tc>
+        <w:tc>
+          <w:tcPr>
+            <w:tcW w:type="dxa" w:w="4320"/>
+          </w:tcPr>
+          <w:p>
+            <w:r>
+              <w:t>0.25</w:t>
+            </w:r>
+          </w:p>
+        </w:tc>
+      </w:tr>
+      <w:tr>
+        <w:tc>
+          <w:tcPr>
+            <w:tcW w:type="dxa" w:w="4320"/>
+          </w:tcPr>
+          <w:p>
+            <w:r>
+              <w:t>food_regrow_time</w:t>
+            </w:r>
+          </w:p>
+        </w:tc>
+        <w:tc>
+          <w:tcPr>
+            <w:tcW w:type="dxa" w:w="4320"/>
+          </w:tcPr>
+          <w:p>
+            <w:r>
+              <w:t>3000</w:t>
+            </w:r>
+          </w:p>
+        </w:tc>
+      </w:tr>
+      <w:tr>
+        <w:tc>
+          <w:tcPr>
+            <w:tcW w:type="dxa" w:w="4320"/>
+          </w:tcPr>
+          <w:p>
+            <w:r>
+              <w:t>worm_decisionmaking_version</w:t>
+            </w:r>
+          </w:p>
+        </w:tc>
+        <w:tc>
+          <w:tcPr>
+            <w:tcW w:type="dxa" w:w="4320"/>
+          </w:tcPr>
+          <w:p>
+            <w:r>
+              <w:t>plasticity</w:t>
+            </w:r>
+          </w:p>
+        </w:tc>
+      </w:tr>
+      <w:tr>
+        <w:tc>
+          <w:tcPr>
+            <w:tcW w:type="dxa" w:w="4320"/>
+          </w:tcPr>
+          <w:p>
+            <w:r>
+              <w:t>worm_energy_capacity</w:t>
+            </w:r>
+          </w:p>
+        </w:tc>
+        <w:tc>
+          <w:tcPr>
+            <w:tcW w:type="dxa" w:w="4320"/>
+          </w:tcPr>
+          <w:p>
+            <w:r>
+              <w:t>30</w:t>
+            </w:r>
+          </w:p>
+        </w:tc>
+      </w:tr>
+      <w:tr>
+        <w:tc>
+          <w:tcPr>
+            <w:tcW w:type="dxa" w:w="4320"/>
+          </w:tcPr>
+          <w:p>
+            <w:r>
+              <w:t>worm_metabolic_rate</w:t>
+            </w:r>
+          </w:p>
+        </w:tc>
+        <w:tc>
+          <w:tcPr>
+            <w:tcW w:type="dxa" w:w="4320"/>
+          </w:tcPr>
+          <w:p>
+            <w:r>
+              <w:t>1</w:t>
+            </w:r>
+          </w:p>
+        </w:tc>
+      </w:tr>
+      <w:tr>
+        <w:tc>
+          <w:tcPr>
+            <w:tcW w:type="dxa" w:w="4320"/>
+          </w:tcPr>
+          <w:p>
+            <w:r>
+              <w:t>worm_movement_cost</w:t>
+            </w:r>
+          </w:p>
+        </w:tc>
+        <w:tc>
+          <w:tcPr>
+            <w:tcW w:type="dxa" w:w="4320"/>
+          </w:tcPr>
+          <w:p>
+            <w:r>
+              <w:t>1</w:t>
+            </w:r>
+          </w:p>
+        </w:tc>
+      </w:tr>
+    </w:tbl>
+    <w:p/>
+    <w:p>
+      <w:pPr>
+        <w:pStyle w:val="Heading2"/>
+      </w:pPr>
+      <w:r>
+        <w:t>Benchmark: Hard-wired Lookup Parameters</w:t>
+      </w:r>
+    </w:p>
+    <w:tbl>
+      <w:tblPr>
+        <w:tblStyle w:val="LightGrid-Accent1"/>
+        <w:tblW w:type="auto" w:w="0"/>
+        <w:tblLook w:firstColumn="1" w:firstRow="1" w:lastColumn="0" w:lastRow="0" w:noHBand="0" w:noVBand="1" w:val="04A0"/>
+      </w:tblPr>
+      <w:tblGrid>
+        <w:gridCol w:w="4320"/>
+        <w:gridCol w:w="4320"/>
+      </w:tblGrid>
+      <w:tr>
+        <w:tc>
+          <w:tcPr>
+            <w:tcW w:type="dxa" w:w="4320"/>
+          </w:tcPr>
+          <w:p>
+            <w:r>
+              <w:t>Parameter</w:t>
+            </w:r>
+          </w:p>
+        </w:tc>
+        <w:tc>
+          <w:tcPr>
+            <w:tcW w:type="dxa" w:w="4320"/>
+          </w:tcPr>
+          <w:p>
+            <w:r>
+              <w:t>Value</w:t>
+            </w:r>
+          </w:p>
+        </w:tc>
+      </w:tr>
+      <w:tr>
+        <w:tc>
+          <w:tcPr>
+            <w:tcW w:type="dxa" w:w="4320"/>
+          </w:tcPr>
+          <w:p>
+            <w:r>
+              <w:t>Filename</w:t>
+            </w:r>
+          </w:p>
+        </w:tc>
+        <w:tc>
+          <w:tcPr>
+            <w:tcW w:type="dxa" w:w="4320"/>
+          </w:tcPr>
+          <w:p>
+            <w:r>
+              <w:t>2026-04-22_20-24-58_lookup</w:t>
+            </w:r>
+          </w:p>
+        </w:tc>
+      </w:tr>
+      <w:tr>
+        <w:tc>
+          <w:tcPr>
+            <w:tcW w:type="dxa" w:w="4320"/>
+          </w:tcPr>
+          <w:p>
+            <w:r>
+              <w:t>brain_max_decision_delay</w:t>
+            </w:r>
+          </w:p>
+        </w:tc>
+        <w:tc>
+          <w:tcPr>
+            <w:tcW w:type="dxa" w:w="4320"/>
+          </w:tcPr>
+          <w:p>
+            <w:r>
+              <w:t>2.0</w:t>
+            </w:r>
+          </w:p>
+        </w:tc>
+      </w:tr>
+      <w:tr>
+        <w:tc>
+          <w:tcPr>
+            <w:tcW w:type="dxa" w:w="4320"/>
+          </w:tcPr>
+          <w:p>
+            <w:r>
+              <w:t>brain_n_neurons</w:t>
+            </w:r>
+          </w:p>
+        </w:tc>
+        <w:tc>
+          <w:tcPr>
+            <w:tcW w:type="dxa" w:w="4320"/>
+          </w:tcPr>
+          <w:p>
+            <w:r>
+              <w:t>11</w:t>
+            </w:r>
+          </w:p>
+        </w:tc>
+      </w:tr>
+      <w:tr>
+        <w:tc>
+          <w:tcPr>
+            <w:tcW w:type="dxa" w:w="4320"/>
+          </w:tcPr>
+          <w:p>
+            <w:r>
+              <w:t>brain_noise_level</w:t>
+            </w:r>
+          </w:p>
+        </w:tc>
+        <w:tc>
+          <w:tcPr>
+            <w:tcW w:type="dxa" w:w="4320"/>
+          </w:tcPr>
+          <w:p>
+            <w:r>
+              <w:t>0.05</w:t>
+            </w:r>
+          </w:p>
+        </w:tc>
+      </w:tr>
+      <w:tr>
+        <w:tc>
+          <w:tcPr>
+            <w:tcW w:type="dxa" w:w="4320"/>
+          </w:tcPr>
+          <w:p>
+            <w:r>
+              <w:t>experiment_evolutionary_algorithm_elite_selection_metric</w:t>
+            </w:r>
+          </w:p>
+        </w:tc>
+        <w:tc>
+          <w:tcPr>
+            <w:tcW w:type="dxa" w:w="4320"/>
+          </w:tcPr>
+          <w:p>
+            <w:r>
+              <w:t>average</w:t>
+            </w:r>
+          </w:p>
+        </w:tc>
+      </w:tr>
+      <w:tr>
+        <w:tc>
+          <w:tcPr>
+            <w:tcW w:type="dxa" w:w="4320"/>
+          </w:tcPr>
+          <w:p>
+            <w:r>
+              <w:t>experiment_evolutionary_algorithm_elite_size</w:t>
+            </w:r>
+          </w:p>
+        </w:tc>
+        <w:tc>
+          <w:tcPr>
+            <w:tcW w:type="dxa" w:w="4320"/>
+          </w:tcPr>
+          <w:p>
+            <w:r>
+              <w:t>1</w:t>
+            </w:r>
+          </w:p>
+        </w:tc>
+      </w:tr>
+      <w:tr>
+        <w:tc>
+          <w:tcPr>
+            <w:tcW w:type="dxa" w:w="4320"/>
+          </w:tcPr>
+          <w:p>
+            <w:r>
+              <w:t>experiment_evolutionary_algorithm_mutation_method</w:t>
+            </w:r>
+          </w:p>
+        </w:tc>
+        <w:tc>
+          <w:tcPr>
+            <w:tcW w:type="dxa" w:w="4320"/>
+          </w:tcPr>
+          <w:p>
+            <w:r>
+              <w:t>simple</w:t>
+            </w:r>
+          </w:p>
+        </w:tc>
+      </w:tr>
+      <w:tr>
+        <w:tc>
+          <w:tcPr>
+            <w:tcW w:type="dxa" w:w="4320"/>
+          </w:tcPr>
+          <w:p>
+            <w:r>
+              <w:t>experiment_evolutionary_algorithm_mutation_rate</w:t>
+            </w:r>
+          </w:p>
+        </w:tc>
+        <w:tc>
+          <w:tcPr>
+            <w:tcW w:type="dxa" w:w="4320"/>
+          </w:tcPr>
+          <w:p>
+            <w:r>
+              <w:t>0.3</w:t>
+            </w:r>
+          </w:p>
+        </w:tc>
+      </w:tr>
+      <w:tr>
+        <w:tc>
+          <w:tcPr>
+            <w:tcW w:type="dxa" w:w="4320"/>
+          </w:tcPr>
+          <w:p>
+            <w:r>
+              <w:t>experiment_evolutionary_algorithm_num_generations</w:t>
+            </w:r>
+          </w:p>
+        </w:tc>
+        <w:tc>
+          <w:tcPr>
+            <w:tcW w:type="dxa" w:w="4320"/>
+          </w:tcPr>
+          <w:p>
+            <w:r>
+              <w:t>1</w:t>
+            </w:r>
+          </w:p>
+        </w:tc>
+      </w:tr>
+      <w:tr>
+        <w:tc>
+          <w:tcPr>
+            <w:tcW w:type="dxa" w:w="4320"/>
+          </w:tcPr>
+          <w:p>
+            <w:r>
+              <w:t>experiment_genome_type</w:t>
+            </w:r>
+          </w:p>
+        </w:tc>
+        <w:tc>
+          <w:tcPr>
+            <w:tcW w:type="dxa" w:w="4320"/>
+          </w:tcPr>
+          <w:p>
+            <w:r>
+              <w:t>lookup</w:t>
+            </w:r>
+          </w:p>
+        </w:tc>
+      </w:tr>
+      <w:tr>
+        <w:tc>
+          <w:tcPr>
+            <w:tcW w:type="dxa" w:w="4320"/>
+          </w:tcPr>
+          <w:p>
+            <w:r>
+              <w:t>experiment_max_ticks</w:t>
+            </w:r>
+          </w:p>
+        </w:tc>
+        <w:tc>
+          <w:tcPr>
+            <w:tcW w:type="dxa" w:w="4320"/>
+          </w:tcPr>
+          <w:p>
+            <w:r>
+              <w:t>2000</w:t>
+            </w:r>
+          </w:p>
+        </w:tc>
+      </w:tr>
+      <w:tr>
+        <w:tc>
+          <w:tcPr>
+            <w:tcW w:type="dxa" w:w="4320"/>
+          </w:tcPr>
+          <w:p>
+            <w:r>
+              <w:t>experiment_n_runs</w:t>
+            </w:r>
+          </w:p>
+        </w:tc>
+        <w:tc>
+          <w:tcPr>
+            <w:tcW w:type="dxa" w:w="4320"/>
+          </w:tcPr>
+          <w:p>
+            <w:r>
+              <w:t>300</w:t>
+            </w:r>
+          </w:p>
+        </w:tc>
+      </w:tr>
+      <w:tr>
+        <w:tc>
+          <w:tcPr>
+            <w:tcW w:type="dxa" w:w="4320"/>
+          </w:tcPr>
+          <w:p>
+            <w:r>
+              <w:t>experiment_population_size</w:t>
+            </w:r>
+          </w:p>
+        </w:tc>
+        <w:tc>
+          <w:tcPr>
+            <w:tcW w:type="dxa" w:w="4320"/>
+          </w:tcPr>
+          <w:p>
+            <w:r>
+              <w:t>1</w:t>
+            </w:r>
+          </w:p>
+        </w:tc>
+      </w:tr>
+      <w:tr>
+        <w:tc>
+          <w:tcPr>
+            <w:tcW w:type="dxa" w:w="4320"/>
+          </w:tcPr>
+          <w:p>
+            <w:r>
+              <w:t>food_feeding_paradigm_initial</w:t>
+            </w:r>
+          </w:p>
+        </w:tc>
+        <w:tc>
+          <w:tcPr>
+            <w:tcW w:type="dxa" w:w="4320"/>
+          </w:tcPr>
+          <w:p>
+            <w:r>
+              <w:t>True</w:t>
+            </w:r>
+          </w:p>
+        </w:tc>
+      </w:tr>
+      <w:tr>
+        <w:tc>
+          <w:tcPr>
+            <w:tcW w:type="dxa" w:w="4320"/>
+          </w:tcPr>
+          <w:p>
+            <w:r>
+              <w:t>food_feeding_paradigm_regrow</w:t>
+            </w:r>
+          </w:p>
+        </w:tc>
+        <w:tc>
+          <w:tcPr>
+            <w:tcW w:type="dxa" w:w="4320"/>
+          </w:tcPr>
+          <w:p>
+            <w:r>
+              <w:t>False</w:t>
+            </w:r>
+          </w:p>
+        </w:tc>
+      </w:tr>
+      <w:tr>
+        <w:tc>
+          <w:tcPr>
+            <w:tcW w:type="dxa" w:w="4320"/>
+          </w:tcPr>
+          <w:p>
+            <w:r>
+              <w:t>food_initial_fraction_per_cell</w:t>
+            </w:r>
+          </w:p>
+        </w:tc>
+        <w:tc>
+          <w:tcPr>
+            <w:tcW w:type="dxa" w:w="4320"/>
+          </w:tcPr>
+          <w:p>
+            <w:r>
+              <w:t>0.25</w:t>
+            </w:r>
+          </w:p>
+        </w:tc>
+      </w:tr>
+      <w:tr>
+        <w:tc>
+          <w:tcPr>
+            <w:tcW w:type="dxa" w:w="4320"/>
+          </w:tcPr>
+          <w:p>
+            <w:r>
+              <w:t>food_regrow_time</w:t>
+            </w:r>
+          </w:p>
+        </w:tc>
+        <w:tc>
+          <w:tcPr>
+            <w:tcW w:type="dxa" w:w="4320"/>
+          </w:tcPr>
+          <w:p>
+            <w:r>
+              <w:t>3000</w:t>
+            </w:r>
+          </w:p>
+        </w:tc>
+      </w:tr>
+      <w:tr>
+        <w:tc>
+          <w:tcPr>
+            <w:tcW w:type="dxa" w:w="4320"/>
+          </w:tcPr>
+          <w:p>
+            <w:r>
+              <w:t>worm_decisionmaking_version</w:t>
+            </w:r>
+          </w:p>
+        </w:tc>
+        <w:tc>
+          <w:tcPr>
+            <w:tcW w:type="dxa" w:w="4320"/>
+          </w:tcPr>
+          <w:p>
+            <w:r>
+              <w:t>plasticity</w:t>
+            </w:r>
+          </w:p>
+        </w:tc>
+      </w:tr>
+      <w:tr>
+        <w:tc>
+          <w:tcPr>
+            <w:tcW w:type="dxa" w:w="4320"/>
+          </w:tcPr>
+          <w:p>
+            <w:r>
+              <w:t>worm_energy_capacity</w:t>
+            </w:r>
+          </w:p>
+        </w:tc>
+        <w:tc>
+          <w:tcPr>
+            <w:tcW w:type="dxa" w:w="4320"/>
+          </w:tcPr>
+          <w:p>
+            <w:r>
+              <w:t>30</w:t>
+            </w:r>
+          </w:p>
+        </w:tc>
+      </w:tr>
+      <w:tr>
+        <w:tc>
+          <w:tcPr>
+            <w:tcW w:type="dxa" w:w="4320"/>
+          </w:tcPr>
+          <w:p>
+            <w:r>
+              <w:t>worm_metabolic_rate</w:t>
+            </w:r>
+          </w:p>
+        </w:tc>
+        <w:tc>
+          <w:tcPr>
+            <w:tcW w:type="dxa" w:w="4320"/>
+          </w:tcPr>
+          <w:p>
+            <w:r>
+              <w:t>1</w:t>
+            </w:r>
+          </w:p>
+        </w:tc>
+      </w:tr>
+      <w:tr>
+        <w:tc>
+          <w:tcPr>
+            <w:tcW w:type="dxa" w:w="4320"/>
+          </w:tcPr>
+          <w:p>
+            <w:r>
+              <w:t>worm_movement_cost</w:t>
+            </w:r>
+          </w:p>
+        </w:tc>
+        <w:tc>
+          <w:tcPr>
+            <w:tcW w:type="dxa" w:w="4320"/>
+          </w:tcPr>
+          <w:p>
+            <w:r>
+              <w:t>1</w:t>
+            </w:r>
+          </w:p>
+        </w:tc>
+      </w:tr>
+    </w:tbl>
+    <w:p/>
+    <w:p>
+      <w:pPr>
+        <w:pStyle w:val="Heading2"/>
+      </w:pPr>
+      <w:r>
+        <w:t>Benchmark: Random networks Parameters</w:t>
+      </w:r>
+    </w:p>
+    <w:tbl>
+      <w:tblPr>
+        <w:tblStyle w:val="LightGrid-Accent1"/>
+        <w:tblW w:type="auto" w:w="0"/>
+        <w:tblLook w:firstColumn="1" w:firstRow="1" w:lastColumn="0" w:lastRow="0" w:noHBand="0" w:noVBand="1" w:val="04A0"/>
+      </w:tblPr>
+      <w:tblGrid>
+        <w:gridCol w:w="4320"/>
+        <w:gridCol w:w="4320"/>
+      </w:tblGrid>
+      <w:tr>
+        <w:tc>
+          <w:tcPr>
+            <w:tcW w:type="dxa" w:w="4320"/>
+          </w:tcPr>
+          <w:p>
+            <w:r>
+              <w:t>Parameter</w:t>
+            </w:r>
+          </w:p>
+        </w:tc>
+        <w:tc>
+          <w:tcPr>
+            <w:tcW w:type="dxa" w:w="4320"/>
+          </w:tcPr>
+          <w:p>
+            <w:r>
+              <w:t>Value</w:t>
+            </w:r>
+          </w:p>
+        </w:tc>
+      </w:tr>
+      <w:tr>
+        <w:tc>
+          <w:tcPr>
+            <w:tcW w:type="dxa" w:w="4320"/>
+          </w:tcPr>
+          <w:p>
+            <w:r>
+              <w:t>Filename</w:t>
+            </w:r>
+          </w:p>
+        </w:tc>
+        <w:tc>
+          <w:tcPr>
+            <w:tcW w:type="dxa" w:w="4320"/>
+          </w:tcPr>
+          <w:p>
+            <w:r>
+              <w:t>2026-04-22_20-38-37_random</w:t>
+            </w:r>
+          </w:p>
+        </w:tc>
+      </w:tr>
+      <w:tr>
+        <w:tc>
+          <w:tcPr>
+            <w:tcW w:type="dxa" w:w="4320"/>
+          </w:tcPr>
+          <w:p>
+            <w:r>
+              <w:t>brain_max_decision_delay</w:t>
+            </w:r>
+          </w:p>
+        </w:tc>
+        <w:tc>
+          <w:tcPr>
+            <w:tcW w:type="dxa" w:w="4320"/>
+          </w:tcPr>
+          <w:p>
+            <w:r>
+              <w:t>2.0</w:t>
+            </w:r>
+          </w:p>
+        </w:tc>
+      </w:tr>
+      <w:tr>
+        <w:tc>
+          <w:tcPr>
+            <w:tcW w:type="dxa" w:w="4320"/>
+          </w:tcPr>
+          <w:p>
+            <w:r>
+              <w:t>brain_n_neurons</w:t>
+            </w:r>
+          </w:p>
+        </w:tc>
+        <w:tc>
+          <w:tcPr>
+            <w:tcW w:type="dxa" w:w="4320"/>
+          </w:tcPr>
+          <w:p>
+            <w:r>
+              <w:t>11</w:t>
+            </w:r>
+          </w:p>
+        </w:tc>
+      </w:tr>
+      <w:tr>
+        <w:tc>
+          <w:tcPr>
+            <w:tcW w:type="dxa" w:w="4320"/>
+          </w:tcPr>
+          <w:p>
+            <w:r>
+              <w:t>brain_noise_level</w:t>
+            </w:r>
+          </w:p>
+        </w:tc>
+        <w:tc>
+          <w:tcPr>
+            <w:tcW w:type="dxa" w:w="4320"/>
+          </w:tcPr>
+          <w:p>
+            <w:r>
+              <w:t>0.05</w:t>
+            </w:r>
+          </w:p>
+        </w:tc>
+      </w:tr>
+      <w:tr>
+        <w:tc>
+          <w:tcPr>
+            <w:tcW w:type="dxa" w:w="4320"/>
+          </w:tcPr>
+          <w:p>
+            <w:r>
+              <w:t>experiment_evolutionary_algorithm_elite_selection_metric</w:t>
+            </w:r>
+          </w:p>
+        </w:tc>
+        <w:tc>
+          <w:tcPr>
+            <w:tcW w:type="dxa" w:w="4320"/>
+          </w:tcPr>
+          <w:p>
+            <w:r>
+              <w:t>average</w:t>
+            </w:r>
+          </w:p>
+        </w:tc>
+      </w:tr>
+      <w:tr>
+        <w:tc>
+          <w:tcPr>
+            <w:tcW w:type="dxa" w:w="4320"/>
+          </w:tcPr>
+          <w:p>
+            <w:r>
+              <w:t>experiment_evolutionary_algorithm_elite_size</w:t>
+            </w:r>
+          </w:p>
+        </w:tc>
+        <w:tc>
+          <w:tcPr>
+            <w:tcW w:type="dxa" w:w="4320"/>
+          </w:tcPr>
+          <w:p>
+            <w:r>
+              <w:t>1</w:t>
+            </w:r>
+          </w:p>
+        </w:tc>
+      </w:tr>
+      <w:tr>
+        <w:tc>
+          <w:tcPr>
+            <w:tcW w:type="dxa" w:w="4320"/>
+          </w:tcPr>
+          <w:p>
+            <w:r>
+              <w:t>experiment_evolutionary_algorithm_mutation_method</w:t>
+            </w:r>
+          </w:p>
+        </w:tc>
+        <w:tc>
+          <w:tcPr>
+            <w:tcW w:type="dxa" w:w="4320"/>
+          </w:tcPr>
+          <w:p>
+            <w:r>
+              <w:t>simple</w:t>
+            </w:r>
+          </w:p>
+        </w:tc>
+      </w:tr>
+      <w:tr>
+        <w:tc>
+          <w:tcPr>
+            <w:tcW w:type="dxa" w:w="4320"/>
+          </w:tcPr>
+          <w:p>
+            <w:r>
+              <w:t>experiment_evolutionary_algorithm_mutation_rate</w:t>
+            </w:r>
+          </w:p>
+        </w:tc>
+        <w:tc>
+          <w:tcPr>
+            <w:tcW w:type="dxa" w:w="4320"/>
+          </w:tcPr>
+          <w:p>
+            <w:r>
+              <w:t>0.3</w:t>
+            </w:r>
+          </w:p>
+        </w:tc>
+      </w:tr>
+      <w:tr>
+        <w:tc>
+          <w:tcPr>
+            <w:tcW w:type="dxa" w:w="4320"/>
+          </w:tcPr>
+          <w:p>
+            <w:r>
+              <w:t>experiment_evolutionary_algorithm_num_generations</w:t>
+            </w:r>
+          </w:p>
+        </w:tc>
+        <w:tc>
+          <w:tcPr>
+            <w:tcW w:type="dxa" w:w="4320"/>
+          </w:tcPr>
+          <w:p>
+            <w:r>
+              <w:t>1</w:t>
+            </w:r>
+          </w:p>
+        </w:tc>
+      </w:tr>
+      <w:tr>
+        <w:tc>
+          <w:tcPr>
+            <w:tcW w:type="dxa" w:w="4320"/>
+          </w:tcPr>
+          <w:p>
+            <w:r>
+              <w:t>experiment_genome_type</w:t>
+            </w:r>
+          </w:p>
+        </w:tc>
+        <w:tc>
+          <w:tcPr>
+            <w:tcW w:type="dxa" w:w="4320"/>
+          </w:tcPr>
+          <w:p>
+            <w:r>
+              <w:t>random</w:t>
+            </w:r>
+          </w:p>
+        </w:tc>
+      </w:tr>
+      <w:tr>
+        <w:tc>
+          <w:tcPr>
+            <w:tcW w:type="dxa" w:w="4320"/>
+          </w:tcPr>
+          <w:p>
+            <w:r>
+              <w:t>experiment_max_ticks</w:t>
+            </w:r>
+          </w:p>
+        </w:tc>
+        <w:tc>
+          <w:tcPr>
+            <w:tcW w:type="dxa" w:w="4320"/>
+          </w:tcPr>
+          <w:p>
+            <w:r>
+              <w:t>2000</w:t>
+            </w:r>
+          </w:p>
+        </w:tc>
+      </w:tr>
+      <w:tr>
+        <w:tc>
+          <w:tcPr>
+            <w:tcW w:type="dxa" w:w="4320"/>
+          </w:tcPr>
+          <w:p>
+            <w:r>
+              <w:t>experiment_n_runs</w:t>
+            </w:r>
+          </w:p>
+        </w:tc>
+        <w:tc>
+          <w:tcPr>
+            <w:tcW w:type="dxa" w:w="4320"/>
+          </w:tcPr>
+          <w:p>
+            <w:r>
+              <w:t>300</w:t>
+            </w:r>
+          </w:p>
+        </w:tc>
+      </w:tr>
+      <w:tr>
+        <w:tc>
+          <w:tcPr>
+            <w:tcW w:type="dxa" w:w="4320"/>
+          </w:tcPr>
+          <w:p>
+            <w:r>
+              <w:t>experiment_population_size</w:t>
+            </w:r>
+          </w:p>
+        </w:tc>
+        <w:tc>
+          <w:tcPr>
+            <w:tcW w:type="dxa" w:w="4320"/>
+          </w:tcPr>
+          <w:p>
+            <w:r>
+              <w:t>100</w:t>
+            </w:r>
+          </w:p>
+        </w:tc>
+      </w:tr>
+      <w:tr>
+        <w:tc>
+          <w:tcPr>
+            <w:tcW w:type="dxa" w:w="4320"/>
+          </w:tcPr>
+          <w:p>
+            <w:r>
+              <w:t>food_feeding_paradigm_initial</w:t>
+            </w:r>
+          </w:p>
+        </w:tc>
+        <w:tc>
+          <w:tcPr>
+            <w:tcW w:type="dxa" w:w="4320"/>
+          </w:tcPr>
+          <w:p>
+            <w:r>
+              <w:t>True</w:t>
+            </w:r>
+          </w:p>
+        </w:tc>
+      </w:tr>
+      <w:tr>
+        <w:tc>
+          <w:tcPr>
+            <w:tcW w:type="dxa" w:w="4320"/>
+          </w:tcPr>
+          <w:p>
+            <w:r>
+              <w:t>food_feeding_paradigm_regrow</w:t>
+            </w:r>
+          </w:p>
+        </w:tc>
+        <w:tc>
+          <w:tcPr>
+            <w:tcW w:type="dxa" w:w="4320"/>
+          </w:tcPr>
+          <w:p>
+            <w:r>
+              <w:t>False</w:t>
+            </w:r>
+          </w:p>
+        </w:tc>
+      </w:tr>
+      <w:tr>
+        <w:tc>
+          <w:tcPr>
+            <w:tcW w:type="dxa" w:w="4320"/>
+          </w:tcPr>
+          <w:p>
+            <w:r>
+              <w:t>food_initial_fraction_per_cell</w:t>
+            </w:r>
+          </w:p>
+        </w:tc>
+        <w:tc>
+          <w:tcPr>
+            <w:tcW w:type="dxa" w:w="4320"/>
+          </w:tcPr>
+          <w:p>
+            <w:r>
+              <w:t>0.25</w:t>
+            </w:r>
+          </w:p>
+        </w:tc>
+      </w:tr>
+      <w:tr>
+        <w:tc>
+          <w:tcPr>
+            <w:tcW w:type="dxa" w:w="4320"/>
+          </w:tcPr>
+          <w:p>
+            <w:r>
+              <w:t>food_regrow_time</w:t>
+            </w:r>
+          </w:p>
+        </w:tc>
+        <w:tc>
+          <w:tcPr>
+            <w:tcW w:type="dxa" w:w="4320"/>
+          </w:tcPr>
+          <w:p>
+            <w:r>
+              <w:t>3000</w:t>
+            </w:r>
+          </w:p>
+        </w:tc>
+      </w:tr>
+      <w:tr>
+        <w:tc>
+          <w:tcPr>
+            <w:tcW w:type="dxa" w:w="4320"/>
+          </w:tcPr>
+          <w:p>
+            <w:r>
+              <w:t>worm_decisionmaking_version</w:t>
+            </w:r>
+          </w:p>
+        </w:tc>
+        <w:tc>
+          <w:tcPr>
+            <w:tcW w:type="dxa" w:w="4320"/>
+          </w:tcPr>
+          <w:p>
+            <w:r>
+              <w:t>plasticity</w:t>
+            </w:r>
+          </w:p>
+        </w:tc>
+      </w:tr>
+      <w:tr>
+        <w:tc>
+          <w:tcPr>
+            <w:tcW w:type="dxa" w:w="4320"/>
+          </w:tcPr>
+          <w:p>
+            <w:r>
+              <w:t>worm_energy_capacity</w:t>
+            </w:r>
+          </w:p>
+        </w:tc>
+        <w:tc>
+          <w:tcPr>
+            <w:tcW w:type="dxa" w:w="4320"/>
+          </w:tcPr>
+          <w:p>
+            <w:r>
+              <w:t>30</w:t>
+            </w:r>
+          </w:p>
+        </w:tc>
+      </w:tr>
+      <w:tr>
+        <w:tc>
+          <w:tcPr>
+            <w:tcW w:type="dxa" w:w="4320"/>
+          </w:tcPr>
+          <w:p>
+            <w:r>
+              <w:t>worm_metabolic_rate</w:t>
+            </w:r>
+          </w:p>
+        </w:tc>
+        <w:tc>
+          <w:tcPr>
+            <w:tcW w:type="dxa" w:w="4320"/>
+          </w:tcPr>
+          <w:p>
+            <w:r>
+              <w:t>1</w:t>
+            </w:r>
+          </w:p>
+        </w:tc>
+      </w:tr>
+      <w:tr>
+        <w:tc>
+          <w:tcPr>
+            <w:tcW w:type="dxa" w:w="4320"/>
+          </w:tcPr>
+          <w:p>
+            <w:r>
+              <w:t>worm_movement_cost</w:t>
+            </w:r>
+          </w:p>
+        </w:tc>
+        <w:tc>
+          <w:tcPr>
+            <w:tcW w:type="dxa" w:w="4320"/>
+          </w:tcPr>
+          <w:p>
+            <w:r>
+              <w:t>1</w:t>
+            </w:r>
+          </w:p>
+        </w:tc>
+      </w:tr>
+    </w:tbl>
+    <w:p/>
     <w:p>
       <w:r>
         <w:drawing>

</xml_diff>

<commit_message>
first darft connectivity analysis included in report
</commit_message>
<xml_diff>
--- a/data/first_ea/analysis/results_slow_mutation.docx
+++ b/data/first_ea/analysis/results_slow_mutation.docx
@@ -1617,9 +1617,404 @@
         <w:pStyle w:val="Heading1"/>
       </w:pPr>
       <w:r>
-        <w:t>Connectivity test</w:t>
+        <w:t>Connectivity</w:t>
       </w:r>
     </w:p>
+    <w:p>
+      <w:pPr>
+        <w:pStyle w:val="Heading2"/>
+      </w:pPr>
+      <w:r>
+        <w:t>Network Topology Summary</w:t>
+      </w:r>
+    </w:p>
+    <w:tbl>
+      <w:tblPr>
+        <w:tblStyle w:val="LightGrid-Accent1"/>
+        <w:tblW w:type="auto" w:w="0"/>
+        <w:tblLook w:firstColumn="1" w:firstRow="1" w:lastColumn="0" w:lastRow="0" w:noHBand="0" w:noVBand="1" w:val="04A0"/>
+      </w:tblPr>
+      <w:tblGrid>
+        <w:gridCol w:w="960"/>
+        <w:gridCol w:w="960"/>
+        <w:gridCol w:w="960"/>
+        <w:gridCol w:w="960"/>
+        <w:gridCol w:w="960"/>
+        <w:gridCol w:w="960"/>
+        <w:gridCol w:w="960"/>
+        <w:gridCol w:w="960"/>
+        <w:gridCol w:w="960"/>
+      </w:tblGrid>
+      <w:tr>
+        <w:tc>
+          <w:tcPr>
+            <w:tcW w:type="dxa" w:w="960"/>
+          </w:tcPr>
+          <w:p>
+            <w:r>
+              <w:t>Source</w:t>
+            </w:r>
+          </w:p>
+        </w:tc>
+        <w:tc>
+          <w:tcPr>
+            <w:tcW w:type="dxa" w:w="960"/>
+          </w:tcPr>
+          <w:p>
+            <w:r>
+              <w:t>Exc Out-Deg</w:t>
+            </w:r>
+          </w:p>
+        </w:tc>
+        <w:tc>
+          <w:tcPr>
+            <w:tcW w:type="dxa" w:w="960"/>
+          </w:tcPr>
+          <w:p>
+            <w:r>
+              <w:t>Exc In-Deg</w:t>
+            </w:r>
+          </w:p>
+        </w:tc>
+        <w:tc>
+          <w:tcPr>
+            <w:tcW w:type="dxa" w:w="960"/>
+          </w:tcPr>
+          <w:p>
+            <w:r>
+              <w:t>Inh Out-Deg</w:t>
+            </w:r>
+          </w:p>
+        </w:tc>
+        <w:tc>
+          <w:tcPr>
+            <w:tcW w:type="dxa" w:w="960"/>
+          </w:tcPr>
+          <w:p>
+            <w:r>
+              <w:t>Inh In-Deg</w:t>
+            </w:r>
+          </w:p>
+        </w:tc>
+        <w:tc>
+          <w:tcPr>
+            <w:tcW w:type="dxa" w:w="960"/>
+          </w:tcPr>
+          <w:p>
+            <w:r>
+              <w:t>Self Conn</w:t>
+            </w:r>
+          </w:p>
+        </w:tc>
+        <w:tc>
+          <w:tcPr>
+            <w:tcW w:type="dxa" w:w="960"/>
+          </w:tcPr>
+          <w:p>
+            <w:r>
+              <w:t>Exc Bidir</w:t>
+            </w:r>
+          </w:p>
+        </w:tc>
+        <w:tc>
+          <w:tcPr>
+            <w:tcW w:type="dxa" w:w="960"/>
+          </w:tcPr>
+          <w:p>
+            <w:r>
+              <w:t>Inh Bidir</w:t>
+            </w:r>
+          </w:p>
+        </w:tc>
+        <w:tc>
+          <w:tcPr>
+            <w:tcW w:type="dxa" w:w="960"/>
+          </w:tcPr>
+          <w:p>
+            <w:r>
+              <w:t>Neurons</w:t>
+            </w:r>
+          </w:p>
+        </w:tc>
+      </w:tr>
+      <w:tr>
+        <w:tc>
+          <w:tcPr>
+            <w:tcW w:type="dxa" w:w="960"/>
+          </w:tcPr>
+          <w:p>
+            <w:r>
+              <w:t>Hard-wired Lookup</w:t>
+            </w:r>
+          </w:p>
+        </w:tc>
+        <w:tc>
+          <w:tcPr>
+            <w:tcW w:type="dxa" w:w="960"/>
+          </w:tcPr>
+          <w:p>
+            <w:r>
+              <w:t>0.82</w:t>
+            </w:r>
+          </w:p>
+        </w:tc>
+        <w:tc>
+          <w:tcPr>
+            <w:tcW w:type="dxa" w:w="960"/>
+          </w:tcPr>
+          <w:p>
+            <w:r>
+              <w:t>0.82</w:t>
+            </w:r>
+          </w:p>
+        </w:tc>
+        <w:tc>
+          <w:tcPr>
+            <w:tcW w:type="dxa" w:w="960"/>
+          </w:tcPr>
+          <w:p>
+            <w:r>
+              <w:t>0.36</w:t>
+            </w:r>
+          </w:p>
+        </w:tc>
+        <w:tc>
+          <w:tcPr>
+            <w:tcW w:type="dxa" w:w="960"/>
+          </w:tcPr>
+          <w:p>
+            <w:r>
+              <w:t>0.36</w:t>
+            </w:r>
+          </w:p>
+        </w:tc>
+        <w:tc>
+          <w:tcPr>
+            <w:tcW w:type="dxa" w:w="960"/>
+          </w:tcPr>
+          <w:p>
+            <w:r>
+              <w:t>0.000</w:t>
+            </w:r>
+          </w:p>
+        </w:tc>
+        <w:tc>
+          <w:tcPr>
+            <w:tcW w:type="dxa" w:w="960"/>
+          </w:tcPr>
+          <w:p>
+            <w:r>
+              <w:t>0.000</w:t>
+            </w:r>
+          </w:p>
+        </w:tc>
+        <w:tc>
+          <w:tcPr>
+            <w:tcW w:type="dxa" w:w="960"/>
+          </w:tcPr>
+          <w:p>
+            <w:r>
+              <w:t>0.000</w:t>
+            </w:r>
+          </w:p>
+        </w:tc>
+        <w:tc>
+          <w:tcPr>
+            <w:tcW w:type="dxa" w:w="960"/>
+          </w:tcPr>
+          <w:p>
+            <w:r>
+              <w:t>11</w:t>
+            </w:r>
+          </w:p>
+        </w:tc>
+      </w:tr>
+      <w:tr>
+        <w:tc>
+          <w:tcPr>
+            <w:tcW w:type="dxa" w:w="960"/>
+          </w:tcPr>
+          <w:p>
+            <w:r>
+              <w:t>Random networks</w:t>
+            </w:r>
+          </w:p>
+        </w:tc>
+        <w:tc>
+          <w:tcPr>
+            <w:tcW w:type="dxa" w:w="960"/>
+          </w:tcPr>
+          <w:p>
+            <w:r>
+              <w:t>2.18</w:t>
+            </w:r>
+          </w:p>
+        </w:tc>
+        <w:tc>
+          <w:tcPr>
+            <w:tcW w:type="dxa" w:w="960"/>
+          </w:tcPr>
+          <w:p>
+            <w:r>
+              <w:t>2.18</w:t>
+            </w:r>
+          </w:p>
+        </w:tc>
+        <w:tc>
+          <w:tcPr>
+            <w:tcW w:type="dxa" w:w="960"/>
+          </w:tcPr>
+          <w:p>
+            <w:r>
+              <w:t>4.36</w:t>
+            </w:r>
+          </w:p>
+        </w:tc>
+        <w:tc>
+          <w:tcPr>
+            <w:tcW w:type="dxa" w:w="960"/>
+          </w:tcPr>
+          <w:p>
+            <w:r>
+              <w:t>4.36</w:t>
+            </w:r>
+          </w:p>
+        </w:tc>
+        <w:tc>
+          <w:tcPr>
+            <w:tcW w:type="dxa" w:w="960"/>
+          </w:tcPr>
+          <w:p>
+            <w:r>
+              <w:t>0.636</w:t>
+            </w:r>
+          </w:p>
+        </w:tc>
+        <w:tc>
+          <w:tcPr>
+            <w:tcW w:type="dxa" w:w="960"/>
+          </w:tcPr>
+          <w:p>
+            <w:r>
+              <w:t>0.104</w:t>
+            </w:r>
+          </w:p>
+        </w:tc>
+        <w:tc>
+          <w:tcPr>
+            <w:tcW w:type="dxa" w:w="960"/>
+          </w:tcPr>
+          <w:p>
+            <w:r>
+              <w:t>0.188</w:t>
+            </w:r>
+          </w:p>
+        </w:tc>
+        <w:tc>
+          <w:tcPr>
+            <w:tcW w:type="dxa" w:w="960"/>
+          </w:tcPr>
+          <w:p>
+            <w:r>
+              <w:t>11</w:t>
+            </w:r>
+          </w:p>
+        </w:tc>
+      </w:tr>
+      <w:tr>
+        <w:tc>
+          <w:tcPr>
+            <w:tcW w:type="dxa" w:w="960"/>
+          </w:tcPr>
+          <w:p>
+            <w:r>
+              <w:t>slow_mutation</w:t>
+            </w:r>
+          </w:p>
+        </w:tc>
+        <w:tc>
+          <w:tcPr>
+            <w:tcW w:type="dxa" w:w="960"/>
+          </w:tcPr>
+          <w:p>
+            <w:r>
+              <w:t>2.27</w:t>
+            </w:r>
+          </w:p>
+        </w:tc>
+        <w:tc>
+          <w:tcPr>
+            <w:tcW w:type="dxa" w:w="960"/>
+          </w:tcPr>
+          <w:p>
+            <w:r>
+              <w:t>2.27</w:t>
+            </w:r>
+          </w:p>
+        </w:tc>
+        <w:tc>
+          <w:tcPr>
+            <w:tcW w:type="dxa" w:w="960"/>
+          </w:tcPr>
+          <w:p>
+            <w:r>
+              <w:t>4.27</w:t>
+            </w:r>
+          </w:p>
+        </w:tc>
+        <w:tc>
+          <w:tcPr>
+            <w:tcW w:type="dxa" w:w="960"/>
+          </w:tcPr>
+          <w:p>
+            <w:r>
+              <w:t>4.27</w:t>
+            </w:r>
+          </w:p>
+        </w:tc>
+        <w:tc>
+          <w:tcPr>
+            <w:tcW w:type="dxa" w:w="960"/>
+          </w:tcPr>
+          <w:p>
+            <w:r>
+              <w:t>0.758</w:t>
+            </w:r>
+          </w:p>
+        </w:tc>
+        <w:tc>
+          <w:tcPr>
+            <w:tcW w:type="dxa" w:w="960"/>
+          </w:tcPr>
+          <w:p>
+            <w:r>
+              <w:t>0.140</w:t>
+            </w:r>
+          </w:p>
+        </w:tc>
+        <w:tc>
+          <w:tcPr>
+            <w:tcW w:type="dxa" w:w="960"/>
+          </w:tcPr>
+          <w:p>
+            <w:r>
+              <w:t>0.241</w:t>
+            </w:r>
+          </w:p>
+        </w:tc>
+        <w:tc>
+          <w:tcPr>
+            <w:tcW w:type="dxa" w:w="960"/>
+          </w:tcPr>
+          <w:p>
+            <w:r>
+              <w:t>11</w:t>
+            </w:r>
+          </w:p>
+        </w:tc>
+      </w:tr>
+    </w:tbl>
+    <w:p/>
     <w:sectPr>
       <w:pgSz w:w="12240" w:h="15840"/>
       <w:pgMar w:top="1440" w:right="1800" w:bottom="1440" w:left="1800" w:header="720" w:footer="720" w:gutter="0"/>

</xml_diff>

<commit_message>
connectivity degree added to report
</commit_message>
<xml_diff>
--- a/data/first_ea/analysis/results_slow_mutation.docx
+++ b/data/first_ea/analysis/results_slow_mutation.docx
@@ -1621,399 +1621,115 @@
       </w:r>
     </w:p>
     <w:p>
-      <w:pPr>
-        <w:pStyle w:val="Heading2"/>
-      </w:pPr>
       <w:r>
-        <w:t>Network Topology Summary</w:t>
+        <w:drawing>
+          <wp:inline xmlns:a="http://schemas.openxmlformats.org/drawingml/2006/main" xmlns:pic="http://schemas.openxmlformats.org/drawingml/2006/picture">
+            <wp:extent cx="5943600" cy="2200779"/>
+            <wp:docPr id="3" name="Picture 3"/>
+            <wp:cNvGraphicFramePr>
+              <a:graphicFrameLocks noChangeAspect="1"/>
+            </wp:cNvGraphicFramePr>
+            <a:graphic>
+              <a:graphicData uri="http://schemas.openxmlformats.org/drawingml/2006/picture">
+                <pic:pic>
+                  <pic:nvPicPr>
+                    <pic:cNvPr id="0" name="topology_connectivity_degrees.png"/>
+                    <pic:cNvPicPr/>
+                  </pic:nvPicPr>
+                  <pic:blipFill>
+                    <a:blip r:embed="rId11"/>
+                    <a:stretch>
+                      <a:fillRect/>
+                    </a:stretch>
+                  </pic:blipFill>
+                  <pic:spPr>
+                    <a:xfrm>
+                      <a:off x="0" y="0"/>
+                      <a:ext cx="5943600" cy="2200779"/>
+                    </a:xfrm>
+                    <a:prstGeom prst="rect"/>
+                  </pic:spPr>
+                </pic:pic>
+              </a:graphicData>
+            </a:graphic>
+          </wp:inline>
+        </w:drawing>
       </w:r>
     </w:p>
-    <w:tbl>
-      <w:tblPr>
-        <w:tblStyle w:val="LightGrid-Accent1"/>
-        <w:tblW w:type="auto" w:w="0"/>
-        <w:tblLook w:firstColumn="1" w:firstRow="1" w:lastColumn="0" w:lastRow="0" w:noHBand="0" w:noVBand="1" w:val="04A0"/>
-      </w:tblPr>
-      <w:tblGrid>
-        <w:gridCol w:w="960"/>
-        <w:gridCol w:w="960"/>
-        <w:gridCol w:w="960"/>
-        <w:gridCol w:w="960"/>
-        <w:gridCol w:w="960"/>
-        <w:gridCol w:w="960"/>
-        <w:gridCol w:w="960"/>
-        <w:gridCol w:w="960"/>
-        <w:gridCol w:w="960"/>
-      </w:tblGrid>
-      <w:tr>
-        <w:tc>
-          <w:tcPr>
-            <w:tcW w:type="dxa" w:w="960"/>
-          </w:tcPr>
-          <w:p>
-            <w:r>
-              <w:t>Source</w:t>
-            </w:r>
-          </w:p>
-        </w:tc>
-        <w:tc>
-          <w:tcPr>
-            <w:tcW w:type="dxa" w:w="960"/>
-          </w:tcPr>
-          <w:p>
-            <w:r>
-              <w:t>Exc Out-Deg</w:t>
-            </w:r>
-          </w:p>
-        </w:tc>
-        <w:tc>
-          <w:tcPr>
-            <w:tcW w:type="dxa" w:w="960"/>
-          </w:tcPr>
-          <w:p>
-            <w:r>
-              <w:t>Exc In-Deg</w:t>
-            </w:r>
-          </w:p>
-        </w:tc>
-        <w:tc>
-          <w:tcPr>
-            <w:tcW w:type="dxa" w:w="960"/>
-          </w:tcPr>
-          <w:p>
-            <w:r>
-              <w:t>Inh Out-Deg</w:t>
-            </w:r>
-          </w:p>
-        </w:tc>
-        <w:tc>
-          <w:tcPr>
-            <w:tcW w:type="dxa" w:w="960"/>
-          </w:tcPr>
-          <w:p>
-            <w:r>
-              <w:t>Inh In-Deg</w:t>
-            </w:r>
-          </w:p>
-        </w:tc>
-        <w:tc>
-          <w:tcPr>
-            <w:tcW w:type="dxa" w:w="960"/>
-          </w:tcPr>
-          <w:p>
-            <w:r>
-              <w:t>Self Conn</w:t>
-            </w:r>
-          </w:p>
-        </w:tc>
-        <w:tc>
-          <w:tcPr>
-            <w:tcW w:type="dxa" w:w="960"/>
-          </w:tcPr>
-          <w:p>
-            <w:r>
-              <w:t>Exc Bidir</w:t>
-            </w:r>
-          </w:p>
-        </w:tc>
-        <w:tc>
-          <w:tcPr>
-            <w:tcW w:type="dxa" w:w="960"/>
-          </w:tcPr>
-          <w:p>
-            <w:r>
-              <w:t>Inh Bidir</w:t>
-            </w:r>
-          </w:p>
-        </w:tc>
-        <w:tc>
-          <w:tcPr>
-            <w:tcW w:type="dxa" w:w="960"/>
-          </w:tcPr>
-          <w:p>
-            <w:r>
-              <w:t>Neurons</w:t>
-            </w:r>
-          </w:p>
-        </w:tc>
-      </w:tr>
-      <w:tr>
-        <w:tc>
-          <w:tcPr>
-            <w:tcW w:type="dxa" w:w="960"/>
-          </w:tcPr>
-          <w:p>
-            <w:r>
-              <w:t>Hard-wired Lookup</w:t>
-            </w:r>
-          </w:p>
-        </w:tc>
-        <w:tc>
-          <w:tcPr>
-            <w:tcW w:type="dxa" w:w="960"/>
-          </w:tcPr>
-          <w:p>
-            <w:r>
-              <w:t>0.82</w:t>
-            </w:r>
-          </w:p>
-        </w:tc>
-        <w:tc>
-          <w:tcPr>
-            <w:tcW w:type="dxa" w:w="960"/>
-          </w:tcPr>
-          <w:p>
-            <w:r>
-              <w:t>0.82</w:t>
-            </w:r>
-          </w:p>
-        </w:tc>
-        <w:tc>
-          <w:tcPr>
-            <w:tcW w:type="dxa" w:w="960"/>
-          </w:tcPr>
-          <w:p>
-            <w:r>
-              <w:t>0.36</w:t>
-            </w:r>
-          </w:p>
-        </w:tc>
-        <w:tc>
-          <w:tcPr>
-            <w:tcW w:type="dxa" w:w="960"/>
-          </w:tcPr>
-          <w:p>
-            <w:r>
-              <w:t>0.36</w:t>
-            </w:r>
-          </w:p>
-        </w:tc>
-        <w:tc>
-          <w:tcPr>
-            <w:tcW w:type="dxa" w:w="960"/>
-          </w:tcPr>
-          <w:p>
-            <w:r>
-              <w:t>0.000</w:t>
-            </w:r>
-          </w:p>
-        </w:tc>
-        <w:tc>
-          <w:tcPr>
-            <w:tcW w:type="dxa" w:w="960"/>
-          </w:tcPr>
-          <w:p>
-            <w:r>
-              <w:t>0.000</w:t>
-            </w:r>
-          </w:p>
-        </w:tc>
-        <w:tc>
-          <w:tcPr>
-            <w:tcW w:type="dxa" w:w="960"/>
-          </w:tcPr>
-          <w:p>
-            <w:r>
-              <w:t>0.000</w:t>
-            </w:r>
-          </w:p>
-        </w:tc>
-        <w:tc>
-          <w:tcPr>
-            <w:tcW w:type="dxa" w:w="960"/>
-          </w:tcPr>
-          <w:p>
-            <w:r>
-              <w:t>11</w:t>
-            </w:r>
-          </w:p>
-        </w:tc>
-      </w:tr>
-      <w:tr>
-        <w:tc>
-          <w:tcPr>
-            <w:tcW w:type="dxa" w:w="960"/>
-          </w:tcPr>
-          <w:p>
-            <w:r>
-              <w:t>Random networks</w:t>
-            </w:r>
-          </w:p>
-        </w:tc>
-        <w:tc>
-          <w:tcPr>
-            <w:tcW w:type="dxa" w:w="960"/>
-          </w:tcPr>
-          <w:p>
-            <w:r>
-              <w:t>2.18</w:t>
-            </w:r>
-          </w:p>
-        </w:tc>
-        <w:tc>
-          <w:tcPr>
-            <w:tcW w:type="dxa" w:w="960"/>
-          </w:tcPr>
-          <w:p>
-            <w:r>
-              <w:t>2.18</w:t>
-            </w:r>
-          </w:p>
-        </w:tc>
-        <w:tc>
-          <w:tcPr>
-            <w:tcW w:type="dxa" w:w="960"/>
-          </w:tcPr>
-          <w:p>
-            <w:r>
-              <w:t>4.36</w:t>
-            </w:r>
-          </w:p>
-        </w:tc>
-        <w:tc>
-          <w:tcPr>
-            <w:tcW w:type="dxa" w:w="960"/>
-          </w:tcPr>
-          <w:p>
-            <w:r>
-              <w:t>4.36</w:t>
-            </w:r>
-          </w:p>
-        </w:tc>
-        <w:tc>
-          <w:tcPr>
-            <w:tcW w:type="dxa" w:w="960"/>
-          </w:tcPr>
-          <w:p>
-            <w:r>
-              <w:t>0.636</w:t>
-            </w:r>
-          </w:p>
-        </w:tc>
-        <w:tc>
-          <w:tcPr>
-            <w:tcW w:type="dxa" w:w="960"/>
-          </w:tcPr>
-          <w:p>
-            <w:r>
-              <w:t>0.104</w:t>
-            </w:r>
-          </w:p>
-        </w:tc>
-        <w:tc>
-          <w:tcPr>
-            <w:tcW w:type="dxa" w:w="960"/>
-          </w:tcPr>
-          <w:p>
-            <w:r>
-              <w:t>0.188</w:t>
-            </w:r>
-          </w:p>
-        </w:tc>
-        <w:tc>
-          <w:tcPr>
-            <w:tcW w:type="dxa" w:w="960"/>
-          </w:tcPr>
-          <w:p>
-            <w:r>
-              <w:t>11</w:t>
-            </w:r>
-          </w:p>
-        </w:tc>
-      </w:tr>
-      <w:tr>
-        <w:tc>
-          <w:tcPr>
-            <w:tcW w:type="dxa" w:w="960"/>
-          </w:tcPr>
-          <w:p>
-            <w:r>
-              <w:t>slow_mutation</w:t>
-            </w:r>
-          </w:p>
-        </w:tc>
-        <w:tc>
-          <w:tcPr>
-            <w:tcW w:type="dxa" w:w="960"/>
-          </w:tcPr>
-          <w:p>
-            <w:r>
-              <w:t>2.27</w:t>
-            </w:r>
-          </w:p>
-        </w:tc>
-        <w:tc>
-          <w:tcPr>
-            <w:tcW w:type="dxa" w:w="960"/>
-          </w:tcPr>
-          <w:p>
-            <w:r>
-              <w:t>2.27</w:t>
-            </w:r>
-          </w:p>
-        </w:tc>
-        <w:tc>
-          <w:tcPr>
-            <w:tcW w:type="dxa" w:w="960"/>
-          </w:tcPr>
-          <w:p>
-            <w:r>
-              <w:t>4.27</w:t>
-            </w:r>
-          </w:p>
-        </w:tc>
-        <w:tc>
-          <w:tcPr>
-            <w:tcW w:type="dxa" w:w="960"/>
-          </w:tcPr>
-          <w:p>
-            <w:r>
-              <w:t>4.27</w:t>
-            </w:r>
-          </w:p>
-        </w:tc>
-        <w:tc>
-          <w:tcPr>
-            <w:tcW w:type="dxa" w:w="960"/>
-          </w:tcPr>
-          <w:p>
-            <w:r>
-              <w:t>0.758</w:t>
-            </w:r>
-          </w:p>
-        </w:tc>
-        <w:tc>
-          <w:tcPr>
-            <w:tcW w:type="dxa" w:w="960"/>
-          </w:tcPr>
-          <w:p>
-            <w:r>
-              <w:t>0.140</w:t>
-            </w:r>
-          </w:p>
-        </w:tc>
-        <w:tc>
-          <w:tcPr>
-            <w:tcW w:type="dxa" w:w="960"/>
-          </w:tcPr>
-          <w:p>
-            <w:r>
-              <w:t>0.241</w:t>
-            </w:r>
-          </w:p>
-        </w:tc>
-        <w:tc>
-          <w:tcPr>
-            <w:tcW w:type="dxa" w:w="960"/>
-          </w:tcPr>
-          <w:p>
-            <w:r>
-              <w:t>11</w:t>
-            </w:r>
-          </w:p>
-        </w:tc>
-      </w:tr>
-    </w:tbl>
+    <w:p/>
+    <w:p>
+      <w:r>
+        <w:drawing>
+          <wp:inline xmlns:a="http://schemas.openxmlformats.org/drawingml/2006/main" xmlns:pic="http://schemas.openxmlformats.org/drawingml/2006/picture">
+            <wp:extent cx="5943600" cy="2200779"/>
+            <wp:docPr id="4" name="Picture 4"/>
+            <wp:cNvGraphicFramePr>
+              <a:graphicFrameLocks noChangeAspect="1"/>
+            </wp:cNvGraphicFramePr>
+            <a:graphic>
+              <a:graphicData uri="http://schemas.openxmlformats.org/drawingml/2006/picture">
+                <pic:pic>
+                  <pic:nvPicPr>
+                    <pic:cNvPr id="0" name="topology_weighted_connectivity.png"/>
+                    <pic:cNvPicPr/>
+                  </pic:nvPicPr>
+                  <pic:blipFill>
+                    <a:blip r:embed="rId12"/>
+                    <a:stretch>
+                      <a:fillRect/>
+                    </a:stretch>
+                  </pic:blipFill>
+                  <pic:spPr>
+                    <a:xfrm>
+                      <a:off x="0" y="0"/>
+                      <a:ext cx="5943600" cy="2200779"/>
+                    </a:xfrm>
+                    <a:prstGeom prst="rect"/>
+                  </pic:spPr>
+                </pic:pic>
+              </a:graphicData>
+            </a:graphic>
+          </wp:inline>
+        </w:drawing>
+      </w:r>
+    </w:p>
+    <w:p/>
+    <w:p>
+      <w:r>
+        <w:drawing>
+          <wp:inline xmlns:a="http://schemas.openxmlformats.org/drawingml/2006/main" xmlns:pic="http://schemas.openxmlformats.org/drawingml/2006/picture">
+            <wp:extent cx="5943600" cy="2200779"/>
+            <wp:docPr id="5" name="Picture 5"/>
+            <wp:cNvGraphicFramePr>
+              <a:graphicFrameLocks noChangeAspect="1"/>
+            </wp:cNvGraphicFramePr>
+            <a:graphic>
+              <a:graphicData uri="http://schemas.openxmlformats.org/drawingml/2006/picture">
+                <pic:pic>
+                  <pic:nvPicPr>
+                    <pic:cNvPr id="0" name="topology_mean_strength.png"/>
+                    <pic:cNvPicPr/>
+                  </pic:nvPicPr>
+                  <pic:blipFill>
+                    <a:blip r:embed="rId13"/>
+                    <a:stretch>
+                      <a:fillRect/>
+                    </a:stretch>
+                  </pic:blipFill>
+                  <pic:spPr>
+                    <a:xfrm>
+                      <a:off x="0" y="0"/>
+                      <a:ext cx="5943600" cy="2200779"/>
+                    </a:xfrm>
+                    <a:prstGeom prst="rect"/>
+                  </pic:spPr>
+                </pic:pic>
+              </a:graphicData>
+            </a:graphic>
+          </wp:inline>
+        </w:drawing>
+      </w:r>
+    </w:p>
     <w:p/>
     <w:sectPr>
       <w:pgSz w:w="12240" w:h="15840"/>

</xml_diff>

<commit_message>
update on network viz
</commit_message>
<xml_diff>
--- a/data/first_ea/analysis/results_slow_mutation.docx
+++ b/data/first_ea/analysis/results_slow_mutation.docx
@@ -1731,6 +1731,199 @@
       </w:r>
     </w:p>
     <w:p/>
+    <w:p>
+      <w:pPr>
+        <w:pStyle w:val="Heading2"/>
+      </w:pPr>
+      <w:r>
+        <w:t>Network Visualizations</w:t>
+      </w:r>
+    </w:p>
+    <w:p>
+      <w:r>
+        <w:drawing>
+          <wp:inline xmlns:a="http://schemas.openxmlformats.org/drawingml/2006/main" xmlns:pic="http://schemas.openxmlformats.org/drawingml/2006/picture">
+            <wp:extent cx="5943600" cy="4613280"/>
+            <wp:docPr id="6" name="Picture 6"/>
+            <wp:cNvGraphicFramePr>
+              <a:graphicFrameLocks noChangeAspect="1"/>
+            </wp:cNvGraphicFramePr>
+            <a:graphic>
+              <a:graphicData uri="http://schemas.openxmlformats.org/drawingml/2006/picture">
+                <pic:pic>
+                  <pic:nvPicPr>
+                    <pic:cNvPr id="0" name="network_slow_mutation_elite_0.png"/>
+                    <pic:cNvPicPr/>
+                  </pic:nvPicPr>
+                  <pic:blipFill>
+                    <a:blip r:embed="rId14"/>
+                    <a:stretch>
+                      <a:fillRect/>
+                    </a:stretch>
+                  </pic:blipFill>
+                  <pic:spPr>
+                    <a:xfrm>
+                      <a:off x="0" y="0"/>
+                      <a:ext cx="5943600" cy="4613280"/>
+                    </a:xfrm>
+                    <a:prstGeom prst="rect"/>
+                  </pic:spPr>
+                </pic:pic>
+              </a:graphicData>
+            </a:graphic>
+          </wp:inline>
+        </w:drawing>
+      </w:r>
+    </w:p>
+    <w:p/>
+    <w:p>
+      <w:r>
+        <w:drawing>
+          <wp:inline xmlns:a="http://schemas.openxmlformats.org/drawingml/2006/main" xmlns:pic="http://schemas.openxmlformats.org/drawingml/2006/picture">
+            <wp:extent cx="5943600" cy="4613280"/>
+            <wp:docPr id="7" name="Picture 7"/>
+            <wp:cNvGraphicFramePr>
+              <a:graphicFrameLocks noChangeAspect="1"/>
+            </wp:cNvGraphicFramePr>
+            <a:graphic>
+              <a:graphicData uri="http://schemas.openxmlformats.org/drawingml/2006/picture">
+                <pic:pic>
+                  <pic:nvPicPr>
+                    <pic:cNvPr id="0" name="network_slow_mutation_elite_1.png"/>
+                    <pic:cNvPicPr/>
+                  </pic:nvPicPr>
+                  <pic:blipFill>
+                    <a:blip r:embed="rId15"/>
+                    <a:stretch>
+                      <a:fillRect/>
+                    </a:stretch>
+                  </pic:blipFill>
+                  <pic:spPr>
+                    <a:xfrm>
+                      <a:off x="0" y="0"/>
+                      <a:ext cx="5943600" cy="4613280"/>
+                    </a:xfrm>
+                    <a:prstGeom prst="rect"/>
+                  </pic:spPr>
+                </pic:pic>
+              </a:graphicData>
+            </a:graphic>
+          </wp:inline>
+        </w:drawing>
+      </w:r>
+    </w:p>
+    <w:p/>
+    <w:p>
+      <w:r>
+        <w:drawing>
+          <wp:inline xmlns:a="http://schemas.openxmlformats.org/drawingml/2006/main" xmlns:pic="http://schemas.openxmlformats.org/drawingml/2006/picture">
+            <wp:extent cx="5943600" cy="4613280"/>
+            <wp:docPr id="8" name="Picture 8"/>
+            <wp:cNvGraphicFramePr>
+              <a:graphicFrameLocks noChangeAspect="1"/>
+            </wp:cNvGraphicFramePr>
+            <a:graphic>
+              <a:graphicData uri="http://schemas.openxmlformats.org/drawingml/2006/picture">
+                <pic:pic>
+                  <pic:nvPicPr>
+                    <pic:cNvPr id="0" name="network_slow_mutation_elite_2.png"/>
+                    <pic:cNvPicPr/>
+                  </pic:nvPicPr>
+                  <pic:blipFill>
+                    <a:blip r:embed="rId16"/>
+                    <a:stretch>
+                      <a:fillRect/>
+                    </a:stretch>
+                  </pic:blipFill>
+                  <pic:spPr>
+                    <a:xfrm>
+                      <a:off x="0" y="0"/>
+                      <a:ext cx="5943600" cy="4613280"/>
+                    </a:xfrm>
+                    <a:prstGeom prst="rect"/>
+                  </pic:spPr>
+                </pic:pic>
+              </a:graphicData>
+            </a:graphic>
+          </wp:inline>
+        </w:drawing>
+      </w:r>
+    </w:p>
+    <w:p/>
+    <w:p>
+      <w:r>
+        <w:drawing>
+          <wp:inline xmlns:a="http://schemas.openxmlformats.org/drawingml/2006/main" xmlns:pic="http://schemas.openxmlformats.org/drawingml/2006/picture">
+            <wp:extent cx="5943600" cy="4613280"/>
+            <wp:docPr id="9" name="Picture 9"/>
+            <wp:cNvGraphicFramePr>
+              <a:graphicFrameLocks noChangeAspect="1"/>
+            </wp:cNvGraphicFramePr>
+            <a:graphic>
+              <a:graphicData uri="http://schemas.openxmlformats.org/drawingml/2006/picture">
+                <pic:pic>
+                  <pic:nvPicPr>
+                    <pic:cNvPr id="0" name="network_connection_weights_hard_wired_lookup_0.png"/>
+                    <pic:cNvPicPr/>
+                  </pic:nvPicPr>
+                  <pic:blipFill>
+                    <a:blip r:embed="rId17"/>
+                    <a:stretch>
+                      <a:fillRect/>
+                    </a:stretch>
+                  </pic:blipFill>
+                  <pic:spPr>
+                    <a:xfrm>
+                      <a:off x="0" y="0"/>
+                      <a:ext cx="5943600" cy="4613280"/>
+                    </a:xfrm>
+                    <a:prstGeom prst="rect"/>
+                  </pic:spPr>
+                </pic:pic>
+              </a:graphicData>
+            </a:graphic>
+          </wp:inline>
+        </w:drawing>
+      </w:r>
+    </w:p>
+    <w:p/>
+    <w:p>
+      <w:r>
+        <w:drawing>
+          <wp:inline xmlns:a="http://schemas.openxmlformats.org/drawingml/2006/main" xmlns:pic="http://schemas.openxmlformats.org/drawingml/2006/picture">
+            <wp:extent cx="5943600" cy="4613280"/>
+            <wp:docPr id="10" name="Picture 10"/>
+            <wp:cNvGraphicFramePr>
+              <a:graphicFrameLocks noChangeAspect="1"/>
+            </wp:cNvGraphicFramePr>
+            <a:graphic>
+              <a:graphicData uri="http://schemas.openxmlformats.org/drawingml/2006/picture">
+                <pic:pic>
+                  <pic:nvPicPr>
+                    <pic:cNvPr id="0" name="network_connection_weights_random_networks_0.png"/>
+                    <pic:cNvPicPr/>
+                  </pic:nvPicPr>
+                  <pic:blipFill>
+                    <a:blip r:embed="rId18"/>
+                    <a:stretch>
+                      <a:fillRect/>
+                    </a:stretch>
+                  </pic:blipFill>
+                  <pic:spPr>
+                    <a:xfrm>
+                      <a:off x="0" y="0"/>
+                      <a:ext cx="5943600" cy="4613280"/>
+                    </a:xfrm>
+                    <a:prstGeom prst="rect"/>
+                  </pic:spPr>
+                </pic:pic>
+              </a:graphicData>
+            </a:graphic>
+          </wp:inline>
+        </w:drawing>
+      </w:r>
+    </w:p>
+    <w:p/>
     <w:sectPr>
       <w:pgSz w:w="12240" w:h="15840"/>
       <w:pgMar w:top="1440" w:right="1800" w:bottom="1440" w:left="1800" w:header="720" w:footer="720" w:gutter="0"/>

</xml_diff>

<commit_message>
network plots in ea report kinda decent
</commit_message>
<xml_diff>
--- a/data/first_ea/analysis/results_slow_mutation.docx
+++ b/data/first_ea/analysis/results_slow_mutation.docx
@@ -1732,6 +1732,43 @@
     </w:p>
     <w:p/>
     <w:p>
+      <w:r>
+        <w:drawing>
+          <wp:inline xmlns:a="http://schemas.openxmlformats.org/drawingml/2006/main" xmlns:pic="http://schemas.openxmlformats.org/drawingml/2006/picture">
+            <wp:extent cx="5943600" cy="2200779"/>
+            <wp:docPr id="6" name="Picture 6"/>
+            <wp:cNvGraphicFramePr>
+              <a:graphicFrameLocks noChangeAspect="1"/>
+            </wp:cNvGraphicFramePr>
+            <a:graphic>
+              <a:graphicData uri="http://schemas.openxmlformats.org/drawingml/2006/picture">
+                <pic:pic>
+                  <pic:nvPicPr>
+                    <pic:cNvPr id="0" name="topology_mean_strength.png"/>
+                    <pic:cNvPicPr/>
+                  </pic:nvPicPr>
+                  <pic:blipFill>
+                    <a:blip r:embed="rId13"/>
+                    <a:stretch>
+                      <a:fillRect/>
+                    </a:stretch>
+                  </pic:blipFill>
+                  <pic:spPr>
+                    <a:xfrm>
+                      <a:off x="0" y="0"/>
+                      <a:ext cx="5943600" cy="2200779"/>
+                    </a:xfrm>
+                    <a:prstGeom prst="rect"/>
+                  </pic:spPr>
+                </pic:pic>
+              </a:graphicData>
+            </a:graphic>
+          </wp:inline>
+        </w:drawing>
+      </w:r>
+    </w:p>
+    <w:p/>
+    <w:p>
       <w:pPr>
         <w:pStyle w:val="Heading2"/>
       </w:pPr>
@@ -1743,8 +1780,8 @@
       <w:r>
         <w:drawing>
           <wp:inline xmlns:a="http://schemas.openxmlformats.org/drawingml/2006/main" xmlns:pic="http://schemas.openxmlformats.org/drawingml/2006/picture">
-            <wp:extent cx="5943600" cy="4613280"/>
-            <wp:docPr id="6" name="Picture 6"/>
+            <wp:extent cx="5943600" cy="5422587"/>
+            <wp:docPr id="7" name="Picture 7"/>
             <wp:cNvGraphicFramePr>
               <a:graphicFrameLocks noChangeAspect="1"/>
             </wp:cNvGraphicFramePr>
@@ -1764,7 +1801,7 @@
                   <pic:spPr>
                     <a:xfrm>
                       <a:off x="0" y="0"/>
-                      <a:ext cx="5943600" cy="4613280"/>
+                      <a:ext cx="5943600" cy="5422587"/>
                     </a:xfrm>
                     <a:prstGeom prst="rect"/>
                   </pic:spPr>
@@ -1780,8 +1817,8 @@
       <w:r>
         <w:drawing>
           <wp:inline xmlns:a="http://schemas.openxmlformats.org/drawingml/2006/main" xmlns:pic="http://schemas.openxmlformats.org/drawingml/2006/picture">
-            <wp:extent cx="5943600" cy="4613280"/>
-            <wp:docPr id="7" name="Picture 7"/>
+            <wp:extent cx="5943600" cy="5422587"/>
+            <wp:docPr id="8" name="Picture 8"/>
             <wp:cNvGraphicFramePr>
               <a:graphicFrameLocks noChangeAspect="1"/>
             </wp:cNvGraphicFramePr>
@@ -1801,7 +1838,7 @@
                   <pic:spPr>
                     <a:xfrm>
                       <a:off x="0" y="0"/>
-                      <a:ext cx="5943600" cy="4613280"/>
+                      <a:ext cx="5943600" cy="5422587"/>
                     </a:xfrm>
                     <a:prstGeom prst="rect"/>
                   </pic:spPr>
@@ -1817,8 +1854,8 @@
       <w:r>
         <w:drawing>
           <wp:inline xmlns:a="http://schemas.openxmlformats.org/drawingml/2006/main" xmlns:pic="http://schemas.openxmlformats.org/drawingml/2006/picture">
-            <wp:extent cx="5943600" cy="4613280"/>
-            <wp:docPr id="8" name="Picture 8"/>
+            <wp:extent cx="5943600" cy="5422587"/>
+            <wp:docPr id="9" name="Picture 9"/>
             <wp:cNvGraphicFramePr>
               <a:graphicFrameLocks noChangeAspect="1"/>
             </wp:cNvGraphicFramePr>
@@ -1838,7 +1875,7 @@
                   <pic:spPr>
                     <a:xfrm>
                       <a:off x="0" y="0"/>
-                      <a:ext cx="5943600" cy="4613280"/>
+                      <a:ext cx="5943600" cy="5422587"/>
                     </a:xfrm>
                     <a:prstGeom prst="rect"/>
                   </pic:spPr>
@@ -1854,8 +1891,8 @@
       <w:r>
         <w:drawing>
           <wp:inline xmlns:a="http://schemas.openxmlformats.org/drawingml/2006/main" xmlns:pic="http://schemas.openxmlformats.org/drawingml/2006/picture">
-            <wp:extent cx="5943600" cy="4613280"/>
-            <wp:docPr id="9" name="Picture 9"/>
+            <wp:extent cx="5943600" cy="5422587"/>
+            <wp:docPr id="10" name="Picture 10"/>
             <wp:cNvGraphicFramePr>
               <a:graphicFrameLocks noChangeAspect="1"/>
             </wp:cNvGraphicFramePr>
@@ -1875,7 +1912,7 @@
                   <pic:spPr>
                     <a:xfrm>
                       <a:off x="0" y="0"/>
-                      <a:ext cx="5943600" cy="4613280"/>
+                      <a:ext cx="5943600" cy="5422587"/>
                     </a:xfrm>
                     <a:prstGeom prst="rect"/>
                   </pic:spPr>
@@ -1891,8 +1928,8 @@
       <w:r>
         <w:drawing>
           <wp:inline xmlns:a="http://schemas.openxmlformats.org/drawingml/2006/main" xmlns:pic="http://schemas.openxmlformats.org/drawingml/2006/picture">
-            <wp:extent cx="5943600" cy="4613280"/>
-            <wp:docPr id="10" name="Picture 10"/>
+            <wp:extent cx="5943600" cy="5422587"/>
+            <wp:docPr id="11" name="Picture 11"/>
             <wp:cNvGraphicFramePr>
               <a:graphicFrameLocks noChangeAspect="1"/>
             </wp:cNvGraphicFramePr>
@@ -1912,7 +1949,7 @@
                   <pic:spPr>
                     <a:xfrm>
                       <a:off x="0" y="0"/>
-                      <a:ext cx="5943600" cy="4613280"/>
+                      <a:ext cx="5943600" cy="5422587"/>
                     </a:xfrm>
                     <a:prstGeom prst="rect"/>
                   </pic:spPr>

</xml_diff>